<commit_message>
fix(pdf-to-svg,graph-editor): VDI で Edge アプリ窓が一瞬で消える問題を修正
VDI/リモートデスクトップで EXE 起動時にアプリ窓が一瞬出て即消える事象に対応。
startup.log が "edge launched pid=..." まで到達することから、Python/サーバ/Edge 起動は
成功し Edge のアプリ窓が描画直後にクラッシュしていると特定。

- Edge 起動に VDI 対策フラグ (--disable-gpu / --disable-gpu-compositing) を追加し
  実 GPU 無しの VDI でも GPU/コンポジタクラッシュを避けるためソフトウェア描画へ固定
- 実行時 temp と Edge プロファイルを exe 隣の data/tmp/<pid> へ集約し
  C ドライブ/%TEMP% 非依存化。tempfile.tempdir 付け替えで loader/rpc の一時も追従。
  子 Edge の TEMP/TMP も同フォルダへ向ける。終了時に run_tmp を丸ごと削除
- 診断ログを data/logs/ へ階層化 (startup.log + 新規 edge.log で Edge 側を観測可能化)
- 設計書/配布運用手順書 (.md 正典 + .docx) へ反映
- PdfToSvg / LabelEditor 両アプリへ同趣旨で適用

併せてワークスペース配下の未追跡ドキュメント類 (docs/editor・graph-editor の
docx/画像/原稿、capture_docs E2E) も取り込み。

Co-Authored-By: Claude Opus 4.8 (1M context) <noreply@anthropic.com>
Claude-Session: https://claude.ai/code/session_01AwF5Q7tauMqrETZF9SGxTV
</commit_message>
<xml_diff>
--- a/docs/pdf-to-svg/PdfToSvg_設計書.docx
+++ b/docs/pdf-to-svg/PdfToSvg_設計書.docx
@@ -3003,7 +3003,7 @@
                 <w:i w:val="0"/>
                 <w:sz w:val="18"/>
               </w:rPr>
-              <w:t>data/startup.log</w:t>
+              <w:t>data/logs/startup.log</w:t>
             </w:r>
           </w:p>
         </w:tc>
@@ -3020,7 +3020,106 @@
                 <w:i w:val="0"/>
                 <w:sz w:val="19"/>
               </w:rPr>
-              <w:t>起動診断ログ（exe は console=False のため stderr の代替）</w:t>
+              <w:t>Python 側起動診断ログ（exe は console=False のため stderr の代替・追記）</w:t>
+            </w:r>
+          </w:p>
+        </w:tc>
+      </w:tr>
+      <w:tr>
+        <w:tc>
+          <w:tcPr>
+            <w:tcW w:type="dxa" w:w="4873"/>
+          </w:tcPr>
+          <w:p>
+            <w:r/>
+            <w:r>
+              <w:rPr>
+                <w:rFonts w:ascii="ＭＳ ゴシック" w:hAnsi="ＭＳ ゴシック" w:eastAsia="ＭＳ ゴシック"/>
+                <w:b w:val="0"/>
+                <w:i w:val="0"/>
+                <w:sz w:val="18"/>
+              </w:rPr>
+              <w:t>data/logs/edge.log</w:t>
+            </w:r>
+          </w:p>
+        </w:tc>
+        <w:tc>
+          <w:tcPr>
+            <w:tcW w:type="dxa" w:w="4873"/>
+          </w:tcPr>
+          <w:p>
+            <w:r/>
+            <w:r>
+              <w:rPr>
+                <w:rFonts w:ascii="Meiryo UI" w:hAnsi="Meiryo UI" w:eastAsia="Meiryo UI"/>
+                <w:b w:val="0"/>
+                <w:i w:val="0"/>
+                <w:sz w:val="19"/>
+              </w:rPr>
+              <w:t>Edge 側ログ（</w:t>
+            </w:r>
+            <w:r>
+              <w:rPr>
+                <w:rFonts w:ascii="ＭＳ ゴシック" w:hAnsi="ＭＳ ゴシック" w:eastAsia="ＭＳ ゴシック"/>
+                <w:b w:val="0"/>
+                <w:i w:val="0"/>
+                <w:sz w:val="18"/>
+              </w:rPr>
+              <w:t>--enable-logging</w:t>
+            </w:r>
+            <w:r>
+              <w:rPr>
+                <w:rFonts w:ascii="Meiryo UI" w:hAnsi="Meiryo UI" w:eastAsia="Meiryo UI"/>
+                <w:b w:val="0"/>
+                <w:i w:val="0"/>
+                <w:sz w:val="19"/>
+              </w:rPr>
+              <w:t>、毎回上書き。アプリ窓のクラッシュ要因の観測窓口）</w:t>
+            </w:r>
+          </w:p>
+        </w:tc>
+      </w:tr>
+      <w:tr>
+        <w:tc>
+          <w:tcPr>
+            <w:tcW w:type="dxa" w:w="4873"/>
+          </w:tcPr>
+          <w:p>
+            <w:r/>
+            <w:r>
+              <w:rPr>
+                <w:rFonts w:ascii="ＭＳ ゴシック" w:hAnsi="ＭＳ ゴシック" w:eastAsia="ＭＳ ゴシック"/>
+                <w:b w:val="0"/>
+                <w:i w:val="0"/>
+                <w:sz w:val="18"/>
+              </w:rPr>
+              <w:t>data/tmp/&lt;pid&gt;/</w:t>
+            </w:r>
+          </w:p>
+        </w:tc>
+        <w:tc>
+          <w:tcPr>
+            <w:tcW w:type="dxa" w:w="4873"/>
+          </w:tcPr>
+          <w:p>
+            <w:r/>
+            <w:r>
+              <w:rPr>
+                <w:rFonts w:ascii="Meiryo UI" w:hAnsi="Meiryo UI" w:eastAsia="Meiryo UI"/>
+                <w:b w:val="0"/>
+                <w:i w:val="0"/>
+                <w:sz w:val="19"/>
+              </w:rPr>
+              <w:t>実行時の作業領域（Edge プロファイル / PDF・JSON 一時）。</w:t>
+            </w:r>
+            <w:r>
+              <w:rPr>
+                <w:rFonts w:ascii="Meiryo UI" w:hAnsi="Meiryo UI" w:eastAsia="Meiryo UI"/>
+                <w:b/>
+                <w:i w:val="0"/>
+                <w:sz w:val="19"/>
+              </w:rPr>
+              <w:t>終了時に丸ごと削除</w:t>
             </w:r>
           </w:p>
         </w:tc>
@@ -3313,6 +3412,94 @@
       </w:pPr>
       <w:r>
         <w:rPr>
+          <w:rFonts w:ascii="Meiryo UI" w:hAnsi="Meiryo UI" w:eastAsia="Meiryo UI"/>
+          <w:b w:val="0"/>
+          <w:i w:val="0"/>
+          <w:sz w:val="21"/>
+        </w:rPr>
+        <w:t xml:space="preserve">起動時に実行専用の作業領域 </w:t>
+      </w:r>
+      <w:r>
+        <w:rPr>
+          <w:rFonts w:ascii="ＭＳ ゴシック" w:hAnsi="ＭＳ ゴシック" w:eastAsia="ＭＳ ゴシック"/>
+          <w:b w:val="0"/>
+          <w:i w:val="0"/>
+          <w:sz w:val="20"/>
+        </w:rPr>
+        <w:t>data/tmp/&lt;pid&gt;</w:t>
+      </w:r>
+      <w:r>
+        <w:rPr>
+          <w:rFonts w:ascii="Meiryo UI" w:hAnsi="Meiryo UI" w:eastAsia="Meiryo UI"/>
+          <w:b w:val="0"/>
+          <w:i w:val="0"/>
+          <w:sz w:val="21"/>
+        </w:rPr>
+        <w:t xml:space="preserve"> を作り、</w:t>
+      </w:r>
+      <w:r>
+        <w:rPr>
+          <w:rFonts w:ascii="ＭＳ ゴシック" w:hAnsi="ＭＳ ゴシック" w:eastAsia="ＭＳ ゴシック"/>
+          <w:b w:val="0"/>
+          <w:i w:val="0"/>
+          <w:sz w:val="20"/>
+        </w:rPr>
+        <w:t>tempfile</w:t>
+      </w:r>
+      <w:r>
+        <w:rPr>
+          <w:rFonts w:ascii="Meiryo UI" w:hAnsi="Meiryo UI" w:eastAsia="Meiryo UI"/>
+          <w:b w:val="0"/>
+          <w:i w:val="0"/>
+          <w:sz w:val="21"/>
+        </w:rPr>
+        <w:t xml:space="preserve"> の既定先をそこへ付け替える（実行時に書く全 temp を exe 隣の </w:t>
+      </w:r>
+      <w:r>
+        <w:rPr>
+          <w:rFonts w:ascii="ＭＳ ゴシック" w:hAnsi="ＭＳ ゴシック" w:eastAsia="ＭＳ ゴシック"/>
+          <w:b w:val="0"/>
+          <w:i w:val="0"/>
+          <w:sz w:val="20"/>
+        </w:rPr>
+        <w:t>data/</w:t>
+      </w:r>
+      <w:r>
+        <w:rPr>
+          <w:rFonts w:ascii="Meiryo UI" w:hAnsi="Meiryo UI" w:eastAsia="Meiryo UI"/>
+          <w:b w:val="0"/>
+          <w:i w:val="0"/>
+          <w:sz w:val="21"/>
+        </w:rPr>
+        <w:t xml:space="preserve"> へ寄せ、C:/</w:t>
+      </w:r>
+      <w:r>
+        <w:rPr>
+          <w:rFonts w:ascii="ＭＳ ゴシック" w:hAnsi="ＭＳ ゴシック" w:eastAsia="ＭＳ ゴシック"/>
+          <w:b w:val="0"/>
+          <w:i w:val="0"/>
+          <w:sz w:val="20"/>
+        </w:rPr>
+        <w:t>%TEMP%</w:t>
+      </w:r>
+      <w:r>
+        <w:rPr>
+          <w:rFonts w:ascii="Meiryo UI" w:hAnsi="Meiryo UI" w:eastAsia="Meiryo UI"/>
+          <w:b w:val="0"/>
+          <w:i w:val="0"/>
+          <w:sz w:val="21"/>
+        </w:rPr>
+        <w:t xml:space="preserve"> に触れない）。</w:t>
+      </w:r>
+    </w:p>
+    <w:p>
+      <w:pPr>
+        <w:pStyle w:val="ListNumber"/>
+        <w:spacing w:after="60"/>
+        <w:ind w:left="340"/>
+      </w:pPr>
+      <w:r>
+        <w:rPr>
           <w:rFonts w:ascii="ＭＳ ゴシック" w:hAnsi="ＭＳ ゴシック" w:eastAsia="ＭＳ ゴシック"/>
           <w:b w:val="0"/>
           <w:i w:val="0"/>
@@ -3343,7 +3530,25 @@
           <w:i w:val="0"/>
           <w:sz w:val="21"/>
         </w:rPr>
-        <w:t xml:space="preserve">専用 user-data-dir（temp）を作り </w:t>
+        <w:t>user-data-dir（</w:t>
+      </w:r>
+      <w:r>
+        <w:rPr>
+          <w:rFonts w:ascii="ＭＳ ゴシック" w:hAnsi="ＭＳ ゴシック" w:eastAsia="ＭＳ ゴシック"/>
+          <w:b w:val="0"/>
+          <w:i w:val="0"/>
+          <w:sz w:val="20"/>
+        </w:rPr>
+        <w:t>data/tmp/&lt;pid&gt;/edge-profile</w:t>
+      </w:r>
+      <w:r>
+        <w:rPr>
+          <w:rFonts w:ascii="Meiryo UI" w:hAnsi="Meiryo UI" w:eastAsia="Meiryo UI"/>
+          <w:b w:val="0"/>
+          <w:i w:val="0"/>
+          <w:sz w:val="21"/>
+        </w:rPr>
+        <w:t xml:space="preserve">）を使い </w:t>
       </w:r>
       <w:r>
         <w:rPr>
@@ -3361,7 +3566,97 @@
           <w:i w:val="0"/>
           <w:sz w:val="21"/>
         </w:rPr>
-        <w:t xml:space="preserve"> で独立プロセスとして起動。</w:t>
+        <w:t xml:space="preserve"> で独立プロセスとして起動。子プロセスの </w:t>
+      </w:r>
+      <w:r>
+        <w:rPr>
+          <w:rFonts w:ascii="ＭＳ ゴシック" w:hAnsi="ＭＳ ゴシック" w:eastAsia="ＭＳ ゴシック"/>
+          <w:b w:val="0"/>
+          <w:i w:val="0"/>
+          <w:sz w:val="20"/>
+        </w:rPr>
+        <w:t>TEMP</w:t>
+      </w:r>
+      <w:r>
+        <w:rPr>
+          <w:rFonts w:ascii="Meiryo UI" w:hAnsi="Meiryo UI" w:eastAsia="Meiryo UI"/>
+          <w:b w:val="0"/>
+          <w:i w:val="0"/>
+          <w:sz w:val="21"/>
+        </w:rPr>
+        <w:t>/</w:t>
+      </w:r>
+      <w:r>
+        <w:rPr>
+          <w:rFonts w:ascii="ＭＳ ゴシック" w:hAnsi="ＭＳ ゴシック" w:eastAsia="ＭＳ ゴシック"/>
+          <w:b w:val="0"/>
+          <w:i w:val="0"/>
+          <w:sz w:val="20"/>
+        </w:rPr>
+        <w:t>TMP</w:t>
+      </w:r>
+      <w:r>
+        <w:rPr>
+          <w:rFonts w:ascii="Meiryo UI" w:hAnsi="Meiryo UI" w:eastAsia="Meiryo UI"/>
+          <w:b w:val="0"/>
+          <w:i w:val="0"/>
+          <w:sz w:val="21"/>
+        </w:rPr>
+        <w:t xml:space="preserve"> も </w:t>
+      </w:r>
+      <w:r>
+        <w:rPr>
+          <w:rFonts w:ascii="ＭＳ ゴシック" w:hAnsi="ＭＳ ゴシック" w:eastAsia="ＭＳ ゴシック"/>
+          <w:b w:val="0"/>
+          <w:i w:val="0"/>
+          <w:sz w:val="20"/>
+        </w:rPr>
+        <w:t>data/tmp/&lt;pid&gt;</w:t>
+      </w:r>
+      <w:r>
+        <w:rPr>
+          <w:rFonts w:ascii="Meiryo UI" w:hAnsi="Meiryo UI" w:eastAsia="Meiryo UI"/>
+          <w:b w:val="0"/>
+          <w:i w:val="0"/>
+          <w:sz w:val="21"/>
+        </w:rPr>
+        <w:t xml:space="preserve"> に向ける。VDI 対策フラグ（</w:t>
+      </w:r>
+      <w:r>
+        <w:rPr>
+          <w:rFonts w:ascii="ＭＳ ゴシック" w:hAnsi="ＭＳ ゴシック" w:eastAsia="ＭＳ ゴシック"/>
+          <w:b w:val="0"/>
+          <w:i w:val="0"/>
+          <w:sz w:val="20"/>
+        </w:rPr>
+        <w:t>--disable-gpu</w:t>
+      </w:r>
+      <w:r>
+        <w:rPr>
+          <w:rFonts w:ascii="Meiryo UI" w:hAnsi="Meiryo UI" w:eastAsia="Meiryo UI"/>
+          <w:b w:val="0"/>
+          <w:i w:val="0"/>
+          <w:sz w:val="21"/>
+        </w:rPr>
+        <w:t xml:space="preserve"> 等）と Edge ログ（</w:t>
+      </w:r>
+      <w:r>
+        <w:rPr>
+          <w:rFonts w:ascii="ＭＳ ゴシック" w:hAnsi="ＭＳ ゴシック" w:eastAsia="ＭＳ ゴシック"/>
+          <w:b w:val="0"/>
+          <w:i w:val="0"/>
+          <w:sz w:val="20"/>
+        </w:rPr>
+        <w:t>--enable-logging --log-file=data/logs/edge.log</w:t>
+      </w:r>
+      <w:r>
+        <w:rPr>
+          <w:rFonts w:ascii="Meiryo UI" w:hAnsi="Meiryo UI" w:eastAsia="Meiryo UI"/>
+          <w:b w:val="0"/>
+          <w:i w:val="0"/>
+          <w:sz w:val="21"/>
+        </w:rPr>
+        <w:t>）を付ける。</w:t>
       </w:r>
     </w:p>
     <w:p>
@@ -3445,7 +3740,25 @@
           <w:i w:val="0"/>
           <w:sz w:val="21"/>
         </w:rPr>
-        <w:t>終了時にサーバを畳み、Edge を terminate、temp プロファイルを削除。</w:t>
+        <w:t>終了時にサーバを畳み、Edge を terminate、</w:t>
+      </w:r>
+      <w:r>
+        <w:rPr>
+          <w:rFonts w:ascii="ＭＳ ゴシック" w:hAnsi="ＭＳ ゴシック" w:eastAsia="ＭＳ ゴシック"/>
+          <w:b w:val="0"/>
+          <w:i w:val="0"/>
+          <w:sz w:val="20"/>
+        </w:rPr>
+        <w:t>data/tmp/&lt;pid&gt;</w:t>
+      </w:r>
+      <w:r>
+        <w:rPr>
+          <w:rFonts w:ascii="Meiryo UI" w:hAnsi="Meiryo UI" w:eastAsia="Meiryo UI"/>
+          <w:b w:val="0"/>
+          <w:i w:val="0"/>
+          <w:sz w:val="21"/>
+        </w:rPr>
+        <w:t xml:space="preserve"> を丸ごと削除（プロファイル・一時を一括清掃）。</w:t>
       </w:r>
     </w:p>
     <w:p>
@@ -3470,6 +3783,156 @@
           <w:sz w:val="20"/>
         </w:rPr>
         <w:t>: サーバ寿命は起動した msedge.exe プロセスに縛らない。Edge はコールド時に自身を別プロセスへ再起動するため、起動プロセスの早期終了でサーバを畳むと初回が空白になる。終了は /quit ＋ watchdog に一本化している。</w:t>
+      </w:r>
+    </w:p>
+    <w:p>
+      <w:pPr>
+        <w:spacing w:before="80" w:after="120"/>
+        <w:shd w:val="clear" w:color="auto" w:fill="EAF2FB"/>
+      </w:pPr>
+      <w:r>
+        <w:rPr>
+          <w:rFonts w:ascii="Meiryo UI" w:hAnsi="Meiryo UI" w:eastAsia="Meiryo UI"/>
+          <w:b/>
+          <w:i w:val="0"/>
+          <w:sz w:val="20"/>
+        </w:rPr>
+        <w:t>VDI/リモートデスクトップ対応</w:t>
+      </w:r>
+      <w:r>
+        <w:rPr>
+          <w:rFonts w:ascii="Meiryo UI" w:hAnsi="Meiryo UI" w:eastAsia="Meiryo UI"/>
+          <w:b w:val="0"/>
+          <w:i w:val="0"/>
+          <w:sz w:val="20"/>
+        </w:rPr>
+        <w:t>: これらの環境は実 GPU が無く Chromium(Edge) の GPU/コンポジタがクラッシュしてアプリ窓が「一瞬出て消える」ため、</w:t>
+      </w:r>
+      <w:r>
+        <w:rPr>
+          <w:rFonts w:ascii="ＭＳ ゴシック" w:hAnsi="ＭＳ ゴシック" w:eastAsia="ＭＳ ゴシック"/>
+          <w:b w:val="0"/>
+          <w:i w:val="0"/>
+          <w:sz w:val="19"/>
+        </w:rPr>
+        <w:t>--disable-gpu</w:t>
+      </w:r>
+      <w:r>
+        <w:rPr>
+          <w:rFonts w:ascii="Meiryo UI" w:hAnsi="Meiryo UI" w:eastAsia="Meiryo UI"/>
+          <w:b w:val="0"/>
+          <w:i w:val="0"/>
+          <w:sz w:val="20"/>
+        </w:rPr>
+        <w:t xml:space="preserve"> 等でソフトウェア描画へ固定する。さらに C ドライブ/</w:t>
+      </w:r>
+      <w:r>
+        <w:rPr>
+          <w:rFonts w:ascii="ＭＳ ゴシック" w:hAnsi="ＭＳ ゴシック" w:eastAsia="ＭＳ ゴシック"/>
+          <w:b w:val="0"/>
+          <w:i w:val="0"/>
+          <w:sz w:val="19"/>
+        </w:rPr>
+        <w:t>%TEMP%</w:t>
+      </w:r>
+      <w:r>
+        <w:rPr>
+          <w:rFonts w:ascii="Meiryo UI" w:hAnsi="Meiryo UI" w:eastAsia="Meiryo UI"/>
+          <w:b w:val="0"/>
+          <w:i w:val="0"/>
+          <w:sz w:val="20"/>
+        </w:rPr>
+        <w:t xml:space="preserve"> がアクセス不可な VDI でも動くよう、実行時 temp と Edge プロファイルを exe 隣の </w:t>
+      </w:r>
+      <w:r>
+        <w:rPr>
+          <w:rFonts w:ascii="ＭＳ ゴシック" w:hAnsi="ＭＳ ゴシック" w:eastAsia="ＭＳ ゴシック"/>
+          <w:b w:val="0"/>
+          <w:i w:val="0"/>
+          <w:sz w:val="19"/>
+        </w:rPr>
+        <w:t>data/tmp/&lt;pid&gt;</w:t>
+      </w:r>
+      <w:r>
+        <w:rPr>
+          <w:rFonts w:ascii="Meiryo UI" w:hAnsi="Meiryo UI" w:eastAsia="Meiryo UI"/>
+          <w:b w:val="0"/>
+          <w:i w:val="0"/>
+          <w:sz w:val="20"/>
+        </w:rPr>
+        <w:t xml:space="preserve"> に集約し、子 Edge の </w:t>
+      </w:r>
+      <w:r>
+        <w:rPr>
+          <w:rFonts w:ascii="ＭＳ ゴシック" w:hAnsi="ＭＳ ゴシック" w:eastAsia="ＭＳ ゴシック"/>
+          <w:b w:val="0"/>
+          <w:i w:val="0"/>
+          <w:sz w:val="19"/>
+        </w:rPr>
+        <w:t>TEMP</w:t>
+      </w:r>
+      <w:r>
+        <w:rPr>
+          <w:rFonts w:ascii="Meiryo UI" w:hAnsi="Meiryo UI" w:eastAsia="Meiryo UI"/>
+          <w:b w:val="0"/>
+          <w:i w:val="0"/>
+          <w:sz w:val="20"/>
+        </w:rPr>
+        <w:t>/</w:t>
+      </w:r>
+      <w:r>
+        <w:rPr>
+          <w:rFonts w:ascii="ＭＳ ゴシック" w:hAnsi="ＭＳ ゴシック" w:eastAsia="ＭＳ ゴシック"/>
+          <w:b w:val="0"/>
+          <w:i w:val="0"/>
+          <w:sz w:val="19"/>
+        </w:rPr>
+        <w:t>TMP</w:t>
+      </w:r>
+      <w:r>
+        <w:rPr>
+          <w:rFonts w:ascii="Meiryo UI" w:hAnsi="Meiryo UI" w:eastAsia="Meiryo UI"/>
+          <w:b w:val="0"/>
+          <w:i w:val="0"/>
+          <w:sz w:val="20"/>
+        </w:rPr>
+        <w:t xml:space="preserve"> もそこへ向ける。なお落ちる場合は </w:t>
+      </w:r>
+      <w:r>
+        <w:rPr>
+          <w:rFonts w:ascii="ＭＳ ゴシック" w:hAnsi="ＭＳ ゴシック" w:eastAsia="ＭＳ ゴシック"/>
+          <w:b w:val="0"/>
+          <w:i w:val="0"/>
+          <w:sz w:val="19"/>
+        </w:rPr>
+        <w:t>data/logs/startup.log</w:t>
+      </w:r>
+      <w:r>
+        <w:rPr>
+          <w:rFonts w:ascii="Meiryo UI" w:hAnsi="Meiryo UI" w:eastAsia="Meiryo UI"/>
+          <w:b w:val="0"/>
+          <w:i w:val="0"/>
+          <w:sz w:val="20"/>
+        </w:rPr>
+        <w:t xml:space="preserve">（Python 側）と </w:t>
+      </w:r>
+      <w:r>
+        <w:rPr>
+          <w:rFonts w:ascii="ＭＳ ゴシック" w:hAnsi="ＭＳ ゴシック" w:eastAsia="ＭＳ ゴシック"/>
+          <w:b w:val="0"/>
+          <w:i w:val="0"/>
+          <w:sz w:val="19"/>
+        </w:rPr>
+        <w:t>data/logs/edge.log</w:t>
+      </w:r>
+      <w:r>
+        <w:rPr>
+          <w:rFonts w:ascii="Meiryo UI" w:hAnsi="Meiryo UI" w:eastAsia="Meiryo UI"/>
+          <w:b w:val="0"/>
+          <w:i w:val="0"/>
+          <w:sz w:val="20"/>
+        </w:rPr>
+        <w:t>（Edge 側）で要因を切り分ける。</w:t>
       </w:r>
     </w:p>
     <w:p>

</xml_diff>